<commit_message>
v2.1: Sync E drive canonical repo
</commit_message>
<xml_diff>
--- a/04_图表/Table_TB_Divergence_Statistics.docx
+++ b/04_图表/Table_TB_Divergence_Statistics.docx
@@ -9098,6 +9098,19 @@
         </w:tc>
       </w:tr>
     </w:tbl>
+    <w:p>
+      <w:pPr>
+        <w:jc w:val="left"/>
+      </w:pPr>
+      <w:r>
+        <w:rPr>
+          <w:b w:val="0"/>
+          <w:i w:val="0"/>
+          <w:color w:val="999999"/>
+        </w:rPr>
+        <w:t>（内容由AI生成，仅供参考）</w:t>
+      </w:r>
+    </w:p>
     <w:sectPr>
       <w:pgSz w:w="12240" w:h="15840"/>
       <w:pgMar w:top="1440" w:right="1800" w:bottom="1440" w:left="1800" w:header="720" w:footer="720" w:gutter="0"/>

</xml_diff>